<commit_message>
CR-015 data: six checked scholarships and loans (R103-R108)
Mahapola, the university bursary, the interest-free student loan (IFSLS),
SLIIT and IIT merit scholarships, and the Ministry's top-500 abroad
scholarship. Every fact spot-checked word for word against its official
source. R108 sits in Study abroad; the others in Scholarships and loans.
TC-149..154 in the Test Plan; 604 passed.

Co-Authored-By: Claude Opus 5.5 (1M context) <noreply@anthropic.com>
</commit_message>
<xml_diff>
--- a/docs/08-test-plan/ZP-DOC-08_Test-Summary-Report.docx
+++ b/docs/08-test-plan/ZP-DOC-08_Test-Summary-Report.docx
@@ -90,7 +90,7 @@
           <w:left w:w="10" w:type="dxa"/>
           <w:right w:w="10" w:type="dxa"/>
         </w:tblCellMar>
-        <w:tblLook w:val="04A0" w:firstRow="1" w:lastRow="0" w:firstColumn="1" w:lastColumn="0" w:noHBand="0" w:noVBand="1"/>
+        <w:tblLook w:val="0000" w:firstRow="0" w:lastRow="0" w:firstColumn="0" w:lastColumn="0" w:noHBand="0" w:noVBand="0"/>
       </w:tblPr>
       <w:tblGrid>
         <w:gridCol w:w="2600"/>
@@ -494,7 +494,7 @@
           <w:left w:w="10" w:type="dxa"/>
           <w:right w:w="10" w:type="dxa"/>
         </w:tblCellMar>
-        <w:tblLook w:val="04A0" w:firstRow="1" w:lastRow="0" w:firstColumn="1" w:lastColumn="0" w:noHBand="0" w:noVBand="1"/>
+        <w:tblLook w:val="0000" w:firstRow="0" w:lastRow="0" w:firstColumn="0" w:lastColumn="0" w:noHBand="0" w:noVBand="0"/>
       </w:tblPr>
       <w:tblGrid>
         <w:gridCol w:w="2600"/>
@@ -1189,7 +1189,7 @@
           <w:left w:w="10" w:type="dxa"/>
           <w:right w:w="10" w:type="dxa"/>
         </w:tblCellMar>
-        <w:tblLook w:val="04A0" w:firstRow="1" w:lastRow="0" w:firstColumn="1" w:lastColumn="0" w:noHBand="0" w:noVBand="1"/>
+        <w:tblLook w:val="0000" w:firstRow="0" w:lastRow="0" w:firstColumn="0" w:lastColumn="0" w:noHBand="0" w:noVBand="0"/>
       </w:tblPr>
       <w:tblGrid>
         <w:gridCol w:w="964"/>
@@ -2066,7 +2066,7 @@
           <w:left w:w="10" w:type="dxa"/>
           <w:right w:w="10" w:type="dxa"/>
         </w:tblCellMar>
-        <w:tblLook w:val="04A0" w:firstRow="1" w:lastRow="0" w:firstColumn="1" w:lastColumn="0" w:noHBand="0" w:noVBand="1"/>
+        <w:tblLook w:val="0000" w:firstRow="0" w:lastRow="0" w:firstColumn="0" w:lastColumn="0" w:noHBand="0" w:noVBand="0"/>
       </w:tblPr>
       <w:tblGrid>
         <w:gridCol w:w="2120"/>
@@ -2423,7 +2423,7 @@
     <w:sdt>
       <w:sdtPr>
         <w:alias w:val="Contents"/>
-        <w:id w:val="-413093629"/>
+        <w:id w:val="-965351106"/>
       </w:sdtPr>
       <w:sdtEndPr/>
       <w:sdtContent>
@@ -2452,7 +2452,7 @@
           <w:r>
             <w:fldChar w:fldCharType="separate"/>
           </w:r>
-          <w:hyperlink w:anchor="_Toc243672262" w:history="1">
+          <w:hyperlink w:anchor="_Toc243678863" w:history="1">
             <w:r>
               <w:rPr>
                 <w:rStyle w:val="Hyperlink"/>
@@ -2476,7 +2476,7 @@
               <w:rPr>
                 <w:noProof/>
               </w:rPr>
-              <w:instrText xml:space="preserve"> PAGEREF _Toc243672262 \h </w:instrText>
+              <w:instrText xml:space="preserve"> PAGEREF _Toc243678863 \h </w:instrText>
             </w:r>
             <w:r>
               <w:rPr>
@@ -2519,7 +2519,7 @@
               <w14:ligatures w14:val="standardContextual"/>
             </w:rPr>
           </w:pPr>
-          <w:hyperlink w:anchor="_Toc243672263" w:history="1">
+          <w:hyperlink w:anchor="_Toc243678864" w:history="1">
             <w:r>
               <w:rPr>
                 <w:rStyle w:val="Hyperlink"/>
@@ -2543,7 +2543,7 @@
               <w:rPr>
                 <w:noProof/>
               </w:rPr>
-              <w:instrText xml:space="preserve"> PAGEREF _Toc243672263 \h </w:instrText>
+              <w:instrText xml:space="preserve"> PAGEREF _Toc243678864 \h </w:instrText>
             </w:r>
             <w:r>
               <w:rPr>
@@ -2586,7 +2586,7 @@
               <w14:ligatures w14:val="standardContextual"/>
             </w:rPr>
           </w:pPr>
-          <w:hyperlink w:anchor="_Toc243672264" w:history="1">
+          <w:hyperlink w:anchor="_Toc243678865" w:history="1">
             <w:r>
               <w:rPr>
                 <w:rStyle w:val="Hyperlink"/>
@@ -2610,7 +2610,7 @@
               <w:rPr>
                 <w:noProof/>
               </w:rPr>
-              <w:instrText xml:space="preserve"> PAGEREF _Toc243672264 \h </w:instrText>
+              <w:instrText xml:space="preserve"> PAGEREF _Toc243678865 \h </w:instrText>
             </w:r>
             <w:r>
               <w:rPr>
@@ -2653,7 +2653,7 @@
               <w14:ligatures w14:val="standardContextual"/>
             </w:rPr>
           </w:pPr>
-          <w:hyperlink w:anchor="_Toc243672265" w:history="1">
+          <w:hyperlink w:anchor="_Toc243678866" w:history="1">
             <w:r>
               <w:rPr>
                 <w:rStyle w:val="Hyperlink"/>
@@ -2677,7 +2677,7 @@
               <w:rPr>
                 <w:noProof/>
               </w:rPr>
-              <w:instrText xml:space="preserve"> PAGEREF _Toc243672265 \h </w:instrText>
+              <w:instrText xml:space="preserve"> PAGEREF _Toc243678866 \h </w:instrText>
             </w:r>
             <w:r>
               <w:rPr>
@@ -2720,7 +2720,7 @@
               <w14:ligatures w14:val="standardContextual"/>
             </w:rPr>
           </w:pPr>
-          <w:hyperlink w:anchor="_Toc243672266" w:history="1">
+          <w:hyperlink w:anchor="_Toc243678867" w:history="1">
             <w:r>
               <w:rPr>
                 <w:rStyle w:val="Hyperlink"/>
@@ -2744,7 +2744,7 @@
               <w:rPr>
                 <w:noProof/>
               </w:rPr>
-              <w:instrText xml:space="preserve"> PAGEREF _Toc243672266 \h </w:instrText>
+              <w:instrText xml:space="preserve"> PAGEREF _Toc243678867 \h </w:instrText>
             </w:r>
             <w:r>
               <w:rPr>
@@ -2787,7 +2787,7 @@
               <w14:ligatures w14:val="standardContextual"/>
             </w:rPr>
           </w:pPr>
-          <w:hyperlink w:anchor="_Toc243672267" w:history="1">
+          <w:hyperlink w:anchor="_Toc243678868" w:history="1">
             <w:r>
               <w:rPr>
                 <w:rStyle w:val="Hyperlink"/>
@@ -2811,7 +2811,7 @@
               <w:rPr>
                 <w:noProof/>
               </w:rPr>
-              <w:instrText xml:space="preserve"> PAGEREF _Toc243672267 \h </w:instrText>
+              <w:instrText xml:space="preserve"> PAGEREF _Toc243678868 \h </w:instrText>
             </w:r>
             <w:r>
               <w:rPr>
@@ -2854,7 +2854,7 @@
               <w14:ligatures w14:val="standardContextual"/>
             </w:rPr>
           </w:pPr>
-          <w:hyperlink w:anchor="_Toc243672268" w:history="1">
+          <w:hyperlink w:anchor="_Toc243678869" w:history="1">
             <w:r>
               <w:rPr>
                 <w:rStyle w:val="Hyperlink"/>
@@ -2878,7 +2878,7 @@
               <w:rPr>
                 <w:noProof/>
               </w:rPr>
-              <w:instrText xml:space="preserve"> PAGEREF _Toc243672268 \h </w:instrText>
+              <w:instrText xml:space="preserve"> PAGEREF _Toc243678869 \h </w:instrText>
             </w:r>
             <w:r>
               <w:rPr>
@@ -2921,7 +2921,7 @@
               <w14:ligatures w14:val="standardContextual"/>
             </w:rPr>
           </w:pPr>
-          <w:hyperlink w:anchor="_Toc243672269" w:history="1">
+          <w:hyperlink w:anchor="_Toc243678870" w:history="1">
             <w:r>
               <w:rPr>
                 <w:rStyle w:val="Hyperlink"/>
@@ -2945,7 +2945,7 @@
               <w:rPr>
                 <w:noProof/>
               </w:rPr>
-              <w:instrText xml:space="preserve"> PAGEREF _Toc243672269 \h </w:instrText>
+              <w:instrText xml:space="preserve"> PAGEREF _Toc243678870 \h </w:instrText>
             </w:r>
             <w:r>
               <w:rPr>
@@ -2988,7 +2988,7 @@
               <w14:ligatures w14:val="standardContextual"/>
             </w:rPr>
           </w:pPr>
-          <w:hyperlink w:anchor="_Toc243672270" w:history="1">
+          <w:hyperlink w:anchor="_Toc243678871" w:history="1">
             <w:r>
               <w:rPr>
                 <w:rStyle w:val="Hyperlink"/>
@@ -3012,7 +3012,7 @@
               <w:rPr>
                 <w:noProof/>
               </w:rPr>
-              <w:instrText xml:space="preserve"> PAGEREF _Toc243672270 \h </w:instrText>
+              <w:instrText xml:space="preserve"> PAGEREF _Toc243678871 \h </w:instrText>
             </w:r>
             <w:r>
               <w:rPr>
@@ -3055,7 +3055,7 @@
               <w14:ligatures w14:val="standardContextual"/>
             </w:rPr>
           </w:pPr>
-          <w:hyperlink w:anchor="_Toc243672271" w:history="1">
+          <w:hyperlink w:anchor="_Toc243678872" w:history="1">
             <w:r>
               <w:rPr>
                 <w:rStyle w:val="Hyperlink"/>
@@ -3079,7 +3079,7 @@
               <w:rPr>
                 <w:noProof/>
               </w:rPr>
-              <w:instrText xml:space="preserve"> PAGEREF _Toc243672271 \h </w:instrText>
+              <w:instrText xml:space="preserve"> PAGEREF _Toc243678872 \h </w:instrText>
             </w:r>
             <w:r>
               <w:rPr>
@@ -3122,7 +3122,7 @@
               <w14:ligatures w14:val="standardContextual"/>
             </w:rPr>
           </w:pPr>
-          <w:hyperlink w:anchor="_Toc243672272" w:history="1">
+          <w:hyperlink w:anchor="_Toc243678873" w:history="1">
             <w:r>
               <w:rPr>
                 <w:rStyle w:val="Hyperlink"/>
@@ -3146,7 +3146,7 @@
               <w:rPr>
                 <w:noProof/>
               </w:rPr>
-              <w:instrText xml:space="preserve"> PAGEREF _Toc243672272 \h </w:instrText>
+              <w:instrText xml:space="preserve"> PAGEREF _Toc243678873 \h </w:instrText>
             </w:r>
             <w:r>
               <w:rPr>
@@ -3189,7 +3189,7 @@
               <w14:ligatures w14:val="standardContextual"/>
             </w:rPr>
           </w:pPr>
-          <w:hyperlink w:anchor="_Toc243672273" w:history="1">
+          <w:hyperlink w:anchor="_Toc243678874" w:history="1">
             <w:r>
               <w:rPr>
                 <w:rStyle w:val="Hyperlink"/>
@@ -3213,7 +3213,7 @@
               <w:rPr>
                 <w:noProof/>
               </w:rPr>
-              <w:instrText xml:space="preserve"> PAGEREF _Toc243672273 \h </w:instrText>
+              <w:instrText xml:space="preserve"> PAGEREF _Toc243678874 \h </w:instrText>
             </w:r>
             <w:r>
               <w:rPr>
@@ -3256,7 +3256,7 @@
               <w14:ligatures w14:val="standardContextual"/>
             </w:rPr>
           </w:pPr>
-          <w:hyperlink w:anchor="_Toc243672274" w:history="1">
+          <w:hyperlink w:anchor="_Toc243678875" w:history="1">
             <w:r>
               <w:rPr>
                 <w:rStyle w:val="Hyperlink"/>
@@ -3280,7 +3280,7 @@
               <w:rPr>
                 <w:noProof/>
               </w:rPr>
-              <w:instrText xml:space="preserve"> PAGEREF _Toc243672274 \h </w:instrText>
+              <w:instrText xml:space="preserve"> PAGEREF _Toc243678875 \h </w:instrText>
             </w:r>
             <w:r>
               <w:rPr>
@@ -3323,7 +3323,7 @@
               <w14:ligatures w14:val="standardContextual"/>
             </w:rPr>
           </w:pPr>
-          <w:hyperlink w:anchor="_Toc243672275" w:history="1">
+          <w:hyperlink w:anchor="_Toc243678876" w:history="1">
             <w:r>
               <w:rPr>
                 <w:rStyle w:val="Hyperlink"/>
@@ -3347,7 +3347,7 @@
               <w:rPr>
                 <w:noProof/>
               </w:rPr>
-              <w:instrText xml:space="preserve"> PAGEREF _Toc243672275 \h </w:instrText>
+              <w:instrText xml:space="preserve"> PAGEREF _Toc243678876 \h </w:instrText>
             </w:r>
             <w:r>
               <w:rPr>
@@ -3390,7 +3390,7 @@
               <w14:ligatures w14:val="standardContextual"/>
             </w:rPr>
           </w:pPr>
-          <w:hyperlink w:anchor="_Toc243672276" w:history="1">
+          <w:hyperlink w:anchor="_Toc243678877" w:history="1">
             <w:r>
               <w:rPr>
                 <w:rStyle w:val="Hyperlink"/>
@@ -3414,7 +3414,7 @@
               <w:rPr>
                 <w:noProof/>
               </w:rPr>
-              <w:instrText xml:space="preserve"> PAGEREF _Toc243672276 \h </w:instrText>
+              <w:instrText xml:space="preserve"> PAGEREF _Toc243678877 \h </w:instrText>
             </w:r>
             <w:r>
               <w:rPr>
@@ -3457,7 +3457,7 @@
               <w14:ligatures w14:val="standardContextual"/>
             </w:rPr>
           </w:pPr>
-          <w:hyperlink w:anchor="_Toc243672277" w:history="1">
+          <w:hyperlink w:anchor="_Toc243678878" w:history="1">
             <w:r>
               <w:rPr>
                 <w:rStyle w:val="Hyperlink"/>
@@ -3481,7 +3481,7 @@
               <w:rPr>
                 <w:noProof/>
               </w:rPr>
-              <w:instrText xml:space="preserve"> PAGEREF _Toc243672277 \h </w:instrText>
+              <w:instrText xml:space="preserve"> PAGEREF _Toc243678878 \h </w:instrText>
             </w:r>
             <w:r>
               <w:rPr>
@@ -3527,7 +3527,7 @@
     <w:sdt>
       <w:sdtPr>
         <w:alias w:val="Tables"/>
-        <w:id w:val="818771246"/>
+        <w:id w:val="1669597891"/>
       </w:sdtPr>
       <w:sdtEndPr/>
       <w:sdtContent>
@@ -3556,7 +3556,7 @@
           <w:r>
             <w:fldChar w:fldCharType="separate"/>
           </w:r>
-          <w:hyperlink w:anchor="_Toc243672278" w:history="1">
+          <w:hyperlink w:anchor="_Toc243678879" w:history="1">
             <w:r>
               <w:rPr>
                 <w:rStyle w:val="Hyperlink"/>
@@ -3580,7 +3580,7 @@
               <w:rPr>
                 <w:noProof/>
               </w:rPr>
-              <w:instrText xml:space="preserve"> PAGEREF _Toc243672278 \h </w:instrText>
+              <w:instrText xml:space="preserve"> PAGEREF _Toc243678879 \h </w:instrText>
             </w:r>
             <w:r>
               <w:rPr>
@@ -3623,7 +3623,7 @@
               <w14:ligatures w14:val="standardContextual"/>
             </w:rPr>
           </w:pPr>
-          <w:hyperlink w:anchor="_Toc243672279" w:history="1">
+          <w:hyperlink w:anchor="_Toc243678880" w:history="1">
             <w:r>
               <w:rPr>
                 <w:rStyle w:val="Hyperlink"/>
@@ -3647,7 +3647,7 @@
               <w:rPr>
                 <w:noProof/>
               </w:rPr>
-              <w:instrText xml:space="preserve"> PAGEREF _Toc243672279 \h </w:instrText>
+              <w:instrText xml:space="preserve"> PAGEREF _Toc243678880 \h </w:instrText>
             </w:r>
             <w:r>
               <w:rPr>
@@ -3690,7 +3690,7 @@
               <w14:ligatures w14:val="standardContextual"/>
             </w:rPr>
           </w:pPr>
-          <w:hyperlink w:anchor="_Toc243672280" w:history="1">
+          <w:hyperlink w:anchor="_Toc243678881" w:history="1">
             <w:r>
               <w:rPr>
                 <w:rStyle w:val="Hyperlink"/>
@@ -3714,7 +3714,7 @@
               <w:rPr>
                 <w:noProof/>
               </w:rPr>
-              <w:instrText xml:space="preserve"> PAGEREF _Toc243672280 \h </w:instrText>
+              <w:instrText xml:space="preserve"> PAGEREF _Toc243678881 \h </w:instrText>
             </w:r>
             <w:r>
               <w:rPr>
@@ -3757,7 +3757,7 @@
               <w14:ligatures w14:val="standardContextual"/>
             </w:rPr>
           </w:pPr>
-          <w:hyperlink w:anchor="_Toc243672281" w:history="1">
+          <w:hyperlink w:anchor="_Toc243678882" w:history="1">
             <w:r>
               <w:rPr>
                 <w:rStyle w:val="Hyperlink"/>
@@ -3781,7 +3781,7 @@
               <w:rPr>
                 <w:noProof/>
               </w:rPr>
-              <w:instrText xml:space="preserve"> PAGEREF _Toc243672281 \h </w:instrText>
+              <w:instrText xml:space="preserve"> PAGEREF _Toc243678882 \h </w:instrText>
             </w:r>
             <w:r>
               <w:rPr>
@@ -3824,7 +3824,7 @@
               <w14:ligatures w14:val="standardContextual"/>
             </w:rPr>
           </w:pPr>
-          <w:hyperlink w:anchor="_Toc243672282" w:history="1">
+          <w:hyperlink w:anchor="_Toc243678883" w:history="1">
             <w:r>
               <w:rPr>
                 <w:rStyle w:val="Hyperlink"/>
@@ -3848,7 +3848,7 @@
               <w:rPr>
                 <w:noProof/>
               </w:rPr>
-              <w:instrText xml:space="preserve"> PAGEREF _Toc243672282 \h </w:instrText>
+              <w:instrText xml:space="preserve"> PAGEREF _Toc243678883 \h </w:instrText>
             </w:r>
             <w:r>
               <w:rPr>
@@ -3891,7 +3891,7 @@
               <w14:ligatures w14:val="standardContextual"/>
             </w:rPr>
           </w:pPr>
-          <w:hyperlink w:anchor="_Toc243672283" w:history="1">
+          <w:hyperlink w:anchor="_Toc243678884" w:history="1">
             <w:r>
               <w:rPr>
                 <w:rStyle w:val="Hyperlink"/>
@@ -3915,7 +3915,7 @@
               <w:rPr>
                 <w:noProof/>
               </w:rPr>
-              <w:instrText xml:space="preserve"> PAGEREF _Toc243672283 \h </w:instrText>
+              <w:instrText xml:space="preserve"> PAGEREF _Toc243678884 \h </w:instrText>
             </w:r>
             <w:r>
               <w:rPr>
@@ -3958,7 +3958,7 @@
               <w14:ligatures w14:val="standardContextual"/>
             </w:rPr>
           </w:pPr>
-          <w:hyperlink w:anchor="_Toc243672284" w:history="1">
+          <w:hyperlink w:anchor="_Toc243678885" w:history="1">
             <w:r>
               <w:rPr>
                 <w:rStyle w:val="Hyperlink"/>
@@ -3982,7 +3982,7 @@
               <w:rPr>
                 <w:noProof/>
               </w:rPr>
-              <w:instrText xml:space="preserve"> PAGEREF _Toc243672284 \h </w:instrText>
+              <w:instrText xml:space="preserve"> PAGEREF _Toc243678885 \h </w:instrText>
             </w:r>
             <w:r>
               <w:rPr>
@@ -4025,7 +4025,7 @@
               <w14:ligatures w14:val="standardContextual"/>
             </w:rPr>
           </w:pPr>
-          <w:hyperlink w:anchor="_Toc243672285" w:history="1">
+          <w:hyperlink w:anchor="_Toc243678886" w:history="1">
             <w:r>
               <w:rPr>
                 <w:rStyle w:val="Hyperlink"/>
@@ -4049,7 +4049,7 @@
               <w:rPr>
                 <w:noProof/>
               </w:rPr>
-              <w:instrText xml:space="preserve"> PAGEREF _Toc243672285 \h </w:instrText>
+              <w:instrText xml:space="preserve"> PAGEREF _Toc243678886 \h </w:instrText>
             </w:r>
             <w:r>
               <w:rPr>
@@ -4092,7 +4092,7 @@
               <w14:ligatures w14:val="standardContextual"/>
             </w:rPr>
           </w:pPr>
-          <w:hyperlink w:anchor="_Toc243672286" w:history="1">
+          <w:hyperlink w:anchor="_Toc243678887" w:history="1">
             <w:r>
               <w:rPr>
                 <w:rStyle w:val="Hyperlink"/>
@@ -4116,7 +4116,7 @@
               <w:rPr>
                 <w:noProof/>
               </w:rPr>
-              <w:instrText xml:space="preserve"> PAGEREF _Toc243672286 \h </w:instrText>
+              <w:instrText xml:space="preserve"> PAGEREF _Toc243678887 \h </w:instrText>
             </w:r>
             <w:r>
               <w:rPr>
@@ -4157,7 +4157,7 @@
         <w:keepLines/>
         <w:pageBreakBefore/>
       </w:pPr>
-      <w:bookmarkStart w:id="0" w:name="_Toc243672262"/>
+      <w:bookmarkStart w:id="0" w:name="_Toc243678863"/>
       <w:r>
         <w:lastRenderedPageBreak/>
         <w:t>1 Introduction</w:t>
@@ -4170,7 +4170,7 @@
         <w:keepNext/>
         <w:keepLines/>
       </w:pPr>
-      <w:bookmarkStart w:id="1" w:name="_Toc243672263"/>
+      <w:bookmarkStart w:id="1" w:name="_Toc243678864"/>
       <w:r>
         <w:t>1.1 Purpose</w:t>
       </w:r>
@@ -4193,7 +4193,7 @@
         <w:keepNext/>
         <w:keepLines/>
       </w:pPr>
-      <w:bookmarkStart w:id="2" w:name="_Toc243672264"/>
+      <w:bookmarkStart w:id="2" w:name="_Toc243678865"/>
       <w:r>
         <w:t>1.2 How the campaign was run</w:t>
       </w:r>
@@ -4237,7 +4237,7 @@
         <w:keepNext/>
         <w:keepLines/>
       </w:pPr>
-      <w:bookmarkStart w:id="3" w:name="_Toc243672265"/>
+      <w:bookmarkStart w:id="3" w:name="_Toc243678866"/>
       <w:r>
         <w:t>1.3 Test environments</w:t>
       </w:r>
@@ -4248,7 +4248,7 @@
         <w:pStyle w:val="Caption"/>
         <w:keepNext/>
       </w:pPr>
-      <w:bookmarkStart w:id="4" w:name="_Toc243672278"/>
+      <w:bookmarkStart w:id="4" w:name="_Toc243678879"/>
       <w:r>
         <w:t xml:space="preserve">Table </w:t>
       </w:r>
@@ -4290,7 +4290,7 @@
           <w:left w:w="10" w:type="dxa"/>
           <w:right w:w="10" w:type="dxa"/>
         </w:tblCellMar>
-        <w:tblLook w:val="04A0" w:firstRow="1" w:lastRow="0" w:firstColumn="1" w:lastColumn="0" w:noHBand="0" w:noVBand="1"/>
+        <w:tblLook w:val="0000" w:firstRow="0" w:lastRow="0" w:firstColumn="0" w:lastColumn="0" w:noHBand="0" w:noVBand="0"/>
       </w:tblPr>
       <w:tblGrid>
         <w:gridCol w:w="4819"/>
@@ -4677,7 +4677,7 @@
         <w:keepLines/>
         <w:pageBreakBefore/>
       </w:pPr>
-      <w:bookmarkStart w:id="5" w:name="_Toc243672266"/>
+      <w:bookmarkStart w:id="5" w:name="_Toc243678867"/>
       <w:r>
         <w:lastRenderedPageBreak/>
         <w:t>2 Results summary</w:t>
@@ -4690,7 +4690,7 @@
         <w:keepNext/>
         <w:keepLines/>
       </w:pPr>
-      <w:bookmarkStart w:id="6" w:name="_Toc243672267"/>
+      <w:bookmarkStart w:id="6" w:name="_Toc243678868"/>
       <w:r>
         <w:t>2.1 Totals</w:t>
       </w:r>
@@ -4701,7 +4701,7 @@
         <w:pStyle w:val="Caption"/>
         <w:keepNext/>
       </w:pPr>
-      <w:bookmarkStart w:id="7" w:name="_Toc243672279"/>
+      <w:bookmarkStart w:id="7" w:name="_Toc243678880"/>
       <w:r>
         <w:t xml:space="preserve">Table </w:t>
       </w:r>
@@ -4743,7 +4743,7 @@
           <w:left w:w="10" w:type="dxa"/>
           <w:right w:w="10" w:type="dxa"/>
         </w:tblCellMar>
-        <w:tblLook w:val="04A0" w:firstRow="1" w:lastRow="0" w:firstColumn="1" w:lastColumn="0" w:noHBand="0" w:noVBand="1"/>
+        <w:tblLook w:val="0000" w:firstRow="0" w:lastRow="0" w:firstColumn="0" w:lastColumn="0" w:noHBand="0" w:noVBand="0"/>
       </w:tblPr>
       <w:tblGrid>
         <w:gridCol w:w="2257"/>
@@ -7724,7 +7724,7 @@
         <w:keepNext/>
         <w:keepLines/>
       </w:pPr>
-      <w:bookmarkStart w:id="8" w:name="_Toc243672268"/>
+      <w:bookmarkStart w:id="8" w:name="_Toc243678869"/>
       <w:r>
         <w:t>2.2 Re-run of 15 October 2026</w:t>
       </w:r>
@@ -7735,7 +7735,7 @@
         <w:pStyle w:val="Caption"/>
         <w:keepNext/>
       </w:pPr>
-      <w:bookmarkStart w:id="9" w:name="_Toc243672280"/>
+      <w:bookmarkStart w:id="9" w:name="_Toc243678881"/>
       <w:r>
         <w:t xml:space="preserve">Table </w:t>
       </w:r>
@@ -7777,7 +7777,7 @@
           <w:left w:w="10" w:type="dxa"/>
           <w:right w:w="10" w:type="dxa"/>
         </w:tblCellMar>
-        <w:tblLook w:val="04A0" w:firstRow="1" w:lastRow="0" w:firstColumn="1" w:lastColumn="0" w:noHBand="0" w:noVBand="1"/>
+        <w:tblLook w:val="0000" w:firstRow="0" w:lastRow="0" w:firstColumn="0" w:lastColumn="0" w:noHBand="0" w:noVBand="0"/>
       </w:tblPr>
       <w:tblGrid>
         <w:gridCol w:w="3682"/>
@@ -8354,7 +8354,7 @@
         <w:pStyle w:val="Caption"/>
         <w:keepNext/>
       </w:pPr>
-      <w:bookmarkStart w:id="10" w:name="_Toc243672281"/>
+      <w:bookmarkStart w:id="10" w:name="_Toc243678882"/>
       <w:r>
         <w:t xml:space="preserve">Table </w:t>
       </w:r>
@@ -8396,7 +8396,7 @@
           <w:left w:w="10" w:type="dxa"/>
           <w:right w:w="10" w:type="dxa"/>
         </w:tblCellMar>
-        <w:tblLook w:val="04A0" w:firstRow="1" w:lastRow="0" w:firstColumn="1" w:lastColumn="0" w:noHBand="0" w:noVBand="1"/>
+        <w:tblLook w:val="0000" w:firstRow="0" w:lastRow="0" w:firstColumn="0" w:lastColumn="0" w:noHBand="0" w:noVBand="0"/>
       </w:tblPr>
       <w:tblGrid>
         <w:gridCol w:w="4116"/>
@@ -8689,7 +8689,7 @@
                 <w:sz w:val="19"/>
                 <w:szCs w:val="19"/>
               </w:rPr>
-              <w:t>CR-013 career-first mode, 23 October</w:t>
+              <w:t>CR-015 scholarships and loans, 23 October</w:t>
             </w:r>
           </w:p>
         </w:tc>
@@ -8719,7 +8719,7 @@
                 <w:sz w:val="19"/>
                 <w:szCs w:val="19"/>
               </w:rPr>
-              <w:t xml:space="preserve">42 files; 598 tests: </w:t>
+              <w:t xml:space="preserve">43 files; 625 tests: </w:t>
             </w:r>
             <w:r>
               <w:rPr>
@@ -8728,30 +8728,14 @@
                 <w:sz w:val="19"/>
                 <w:szCs w:val="19"/>
               </w:rPr>
-              <w:t>577 passed, 0 failed</w:t>
-            </w:r>
-            <w:r>
-              <w:rPr>
-                <w:sz w:val="19"/>
-                <w:szCs w:val="19"/>
-              </w:rPr>
-              <w:t xml:space="preserve">; new </w:t>
-            </w:r>
-            <w:r>
-              <w:rPr>
-                <w:rFonts w:ascii="Consolas" w:eastAsia="Consolas" w:hAnsi="Consolas" w:cs="Consolas"/>
-                <w:sz w:val="17"/>
-                <w:szCs w:val="17"/>
-                <w:shd w:val="clear" w:color="auto" w:fill="F2F4F3"/>
-              </w:rPr>
-              <w:t>worker/careers.test.ts</w:t>
-            </w:r>
-            <w:r>
-              <w:rPr>
-                <w:sz w:val="19"/>
-                <w:szCs w:val="19"/>
-              </w:rPr>
-              <w:t xml:space="preserve"> (7), TC-147</w:t>
+              <w:t>604 passed, 0 failed</w:t>
+            </w:r>
+            <w:r>
+              <w:rPr>
+                <w:sz w:val="19"/>
+                <w:szCs w:val="19"/>
+              </w:rPr>
+              <w:t>; TC-149 to TC-154 (21)</w:t>
             </w:r>
           </w:p>
         </w:tc>
@@ -8793,7 +8777,7 @@
                 <w:sz w:val="19"/>
                 <w:szCs w:val="19"/>
               </w:rPr>
-              <w:t>Search inside other paths, 23 October</w:t>
+              <w:t>CR-013 career-first mode, 23 October</w:t>
             </w:r>
           </w:p>
         </w:tc>
@@ -8824,7 +8808,7 @@
                 <w:sz w:val="19"/>
                 <w:szCs w:val="19"/>
               </w:rPr>
-              <w:t xml:space="preserve">41 files; 591 tests: </w:t>
+              <w:t xml:space="preserve">42 files; 598 tests: </w:t>
             </w:r>
             <w:r>
               <w:rPr>
@@ -8833,7 +8817,7 @@
                 <w:sz w:val="19"/>
                 <w:szCs w:val="19"/>
               </w:rPr>
-              <w:t>570 passed, 0 failed</w:t>
+              <w:t>577 passed, 0 failed</w:t>
             </w:r>
             <w:r>
               <w:rPr>
@@ -8849,14 +8833,14 @@
                 <w:szCs w:val="17"/>
                 <w:shd w:val="clear" w:color="auto" w:fill="F2F4F3"/>
               </w:rPr>
-              <w:t>shared/route-search.test.ts</w:t>
-            </w:r>
-            <w:r>
-              <w:rPr>
-                <w:sz w:val="19"/>
-                <w:szCs w:val="19"/>
-              </w:rPr>
-              <w:t xml:space="preserve"> (6), TC-146</w:t>
+              <w:t>worker/careers.test.ts</w:t>
+            </w:r>
+            <w:r>
+              <w:rPr>
+                <w:sz w:val="19"/>
+                <w:szCs w:val="19"/>
+              </w:rPr>
+              <w:t xml:space="preserve"> (7), TC-147</w:t>
             </w:r>
           </w:p>
         </w:tc>
@@ -8897,7 +8881,7 @@
                 <w:sz w:val="19"/>
                 <w:szCs w:val="19"/>
               </w:rPr>
-              <w:t>Real costs, 23 October</w:t>
+              <w:t>Search inside other paths, 23 October</w:t>
             </w:r>
           </w:p>
         </w:tc>
@@ -8927,7 +8911,7 @@
                 <w:sz w:val="19"/>
                 <w:szCs w:val="19"/>
               </w:rPr>
-              <w:t xml:space="preserve">40 files; 585 tests: </w:t>
+              <w:t xml:space="preserve">41 files; 591 tests: </w:t>
             </w:r>
             <w:r>
               <w:rPr>
@@ -8936,14 +8920,14 @@
                 <w:sz w:val="19"/>
                 <w:szCs w:val="19"/>
               </w:rPr>
-              <w:t>564 passed, 0 failed</w:t>
-            </w:r>
-            <w:r>
-              <w:rPr>
-                <w:sz w:val="19"/>
-                <w:szCs w:val="19"/>
-              </w:rPr>
-              <w:t xml:space="preserve">; TC-145 (4) in </w:t>
+              <w:t>570 passed, 0 failed</w:t>
+            </w:r>
+            <w:r>
+              <w:rPr>
+                <w:sz w:val="19"/>
+                <w:szCs w:val="19"/>
+              </w:rPr>
+              <w:t xml:space="preserve">; new </w:t>
             </w:r>
             <w:r>
               <w:rPr>
@@ -8952,7 +8936,14 @@
                 <w:szCs w:val="17"/>
                 <w:shd w:val="clear" w:color="auto" w:fill="F2F4F3"/>
               </w:rPr>
-              <w:t>worker/routes-expansion.test.ts</w:t>
+              <w:t>shared/route-search.test.ts</w:t>
+            </w:r>
+            <w:r>
+              <w:rPr>
+                <w:sz w:val="19"/>
+                <w:szCs w:val="19"/>
+              </w:rPr>
+              <w:t xml:space="preserve"> (6), TC-146</w:t>
             </w:r>
           </w:p>
         </w:tc>
@@ -8994,7 +8985,7 @@
                 <w:sz w:val="19"/>
                 <w:szCs w:val="19"/>
               </w:rPr>
-              <w:t>Other paths expanded, 23 October</w:t>
+              <w:t>Real costs, 23 October</w:t>
             </w:r>
           </w:p>
         </w:tc>
@@ -9025,7 +9016,7 @@
                 <w:sz w:val="19"/>
                 <w:szCs w:val="19"/>
               </w:rPr>
-              <w:t xml:space="preserve">40 files; 581 tests: </w:t>
+              <w:t xml:space="preserve">40 files; 585 tests: </w:t>
             </w:r>
             <w:r>
               <w:rPr>
@@ -9034,14 +9025,14 @@
                 <w:sz w:val="19"/>
                 <w:szCs w:val="19"/>
               </w:rPr>
-              <w:t>560 passed, 0 failed</w:t>
-            </w:r>
-            <w:r>
-              <w:rPr>
-                <w:sz w:val="19"/>
-                <w:szCs w:val="19"/>
-              </w:rPr>
-              <w:t xml:space="preserve">; new </w:t>
+              <w:t>564 passed, 0 failed</w:t>
+            </w:r>
+            <w:r>
+              <w:rPr>
+                <w:sz w:val="19"/>
+                <w:szCs w:val="19"/>
+              </w:rPr>
+              <w:t xml:space="preserve">; TC-145 (4) in </w:t>
             </w:r>
             <w:r>
               <w:rPr>
@@ -9051,13 +9042,6 @@
                 <w:shd w:val="clear" w:color="auto" w:fill="F2F4F3"/>
               </w:rPr>
               <w:t>worker/routes-expansion.test.ts</w:t>
-            </w:r>
-            <w:r>
-              <w:rPr>
-                <w:sz w:val="19"/>
-                <w:szCs w:val="19"/>
-              </w:rPr>
-              <w:t xml:space="preserve"> (6), TC-144</w:t>
             </w:r>
           </w:p>
         </w:tc>
@@ -9098,7 +9082,7 @@
                 <w:sz w:val="19"/>
                 <w:szCs w:val="19"/>
               </w:rPr>
-              <w:t>Unknown cost fix, 23 October</w:t>
+              <w:t>Other paths expanded, 23 October</w:t>
             </w:r>
           </w:p>
         </w:tc>
@@ -9128,7 +9112,7 @@
                 <w:sz w:val="19"/>
                 <w:szCs w:val="19"/>
               </w:rPr>
-              <w:t xml:space="preserve">39 files; 575 tests: </w:t>
+              <w:t xml:space="preserve">40 files; 581 tests: </w:t>
             </w:r>
             <w:r>
               <w:rPr>
@@ -9137,14 +9121,14 @@
                 <w:sz w:val="19"/>
                 <w:szCs w:val="19"/>
               </w:rPr>
-              <w:t>554 passed, 0 failed</w:t>
-            </w:r>
-            <w:r>
-              <w:rPr>
-                <w:sz w:val="19"/>
-                <w:szCs w:val="19"/>
-              </w:rPr>
-              <w:t xml:space="preserve">; </w:t>
+              <w:t>560 passed, 0 failed</w:t>
+            </w:r>
+            <w:r>
+              <w:rPr>
+                <w:sz w:val="19"/>
+                <w:szCs w:val="19"/>
+              </w:rPr>
+              <w:t xml:space="preserve">; new </w:t>
             </w:r>
             <w:r>
               <w:rPr>
@@ -9153,14 +9137,14 @@
                 <w:szCs w:val="17"/>
                 <w:shd w:val="clear" w:color="auto" w:fill="F2F4F3"/>
               </w:rPr>
-              <w:t>worker/routes-free.test.ts</w:t>
-            </w:r>
-            <w:r>
-              <w:rPr>
-                <w:sz w:val="19"/>
-                <w:szCs w:val="19"/>
-              </w:rPr>
-              <w:t xml:space="preserve"> now 3 (Praveen: "why are all prof bodies free")</w:t>
+              <w:t>worker/routes-expansion.test.ts</w:t>
+            </w:r>
+            <w:r>
+              <w:rPr>
+                <w:sz w:val="19"/>
+                <w:szCs w:val="19"/>
+              </w:rPr>
+              <w:t xml:space="preserve"> (6), TC-144</w:t>
             </w:r>
           </w:p>
         </w:tc>
@@ -9202,7 +9186,7 @@
                 <w:sz w:val="19"/>
                 <w:szCs w:val="19"/>
               </w:rPr>
-              <w:t>Other paths refreshed, 23 October</w:t>
+              <w:t>Unknown cost fix, 23 October</w:t>
             </w:r>
           </w:p>
         </w:tc>
@@ -9233,7 +9217,7 @@
                 <w:sz w:val="19"/>
                 <w:szCs w:val="19"/>
               </w:rPr>
-              <w:t xml:space="preserve">39 files; 574 tests: </w:t>
+              <w:t xml:space="preserve">39 files; 575 tests: </w:t>
             </w:r>
             <w:r>
               <w:rPr>
@@ -9242,14 +9226,14 @@
                 <w:sz w:val="19"/>
                 <w:szCs w:val="19"/>
               </w:rPr>
-              <w:t>553 passed, 0 failed</w:t>
-            </w:r>
-            <w:r>
-              <w:rPr>
-                <w:sz w:val="19"/>
-                <w:szCs w:val="19"/>
-              </w:rPr>
-              <w:t>; TC-143 (</w:t>
+              <w:t>554 passed, 0 failed</w:t>
+            </w:r>
+            <w:r>
+              <w:rPr>
+                <w:sz w:val="19"/>
+                <w:szCs w:val="19"/>
+              </w:rPr>
+              <w:t xml:space="preserve">; </w:t>
             </w:r>
             <w:r>
               <w:rPr>
@@ -9265,7 +9249,7 @@
                 <w:sz w:val="19"/>
                 <w:szCs w:val="19"/>
               </w:rPr>
-              <w:t>, 2), OUSL alert (TC-106), blocked hosts never linked by Ask (ASK-047)</w:t>
+              <w:t xml:space="preserve"> now 3 (Praveen: "why are all prof bodies free")</w:t>
             </w:r>
           </w:p>
         </w:tc>
@@ -9306,7 +9290,7 @@
                 <w:sz w:val="19"/>
                 <w:szCs w:val="19"/>
               </w:rPr>
-              <w:t>CR-012 revised, 23 October</w:t>
+              <w:t>Other paths refreshed, 23 October</w:t>
             </w:r>
           </w:p>
         </w:tc>
@@ -9336,7 +9320,7 @@
                 <w:sz w:val="19"/>
                 <w:szCs w:val="19"/>
               </w:rPr>
-              <w:t xml:space="preserve">38 files; 570 tests: </w:t>
+              <w:t xml:space="preserve">39 files; 574 tests: </w:t>
             </w:r>
             <w:r>
               <w:rPr>
@@ -9345,14 +9329,14 @@
                 <w:sz w:val="19"/>
                 <w:szCs w:val="19"/>
               </w:rPr>
-              <w:t>549 passed, 0 failed</w:t>
-            </w:r>
-            <w:r>
-              <w:rPr>
-                <w:sz w:val="19"/>
-                <w:szCs w:val="19"/>
-              </w:rPr>
-              <w:t xml:space="preserve">; </w:t>
+              <w:t>553 passed, 0 failed</w:t>
+            </w:r>
+            <w:r>
+              <w:rPr>
+                <w:sz w:val="19"/>
+                <w:szCs w:val="19"/>
+              </w:rPr>
+              <w:t>; TC-143 (</w:t>
             </w:r>
             <w:r>
               <w:rPr>
@@ -9361,14 +9345,14 @@
                 <w:szCs w:val="17"/>
                 <w:shd w:val="clear" w:color="auto" w:fill="F2F4F3"/>
               </w:rPr>
-              <w:t>src/apply.test.ts</w:t>
-            </w:r>
-            <w:r>
-              <w:rPr>
-                <w:sz w:val="19"/>
-                <w:szCs w:val="19"/>
-              </w:rPr>
-              <w:t xml:space="preserve"> now 6</w:t>
+              <w:t>worker/routes-free.test.ts</w:t>
+            </w:r>
+            <w:r>
+              <w:rPr>
+                <w:sz w:val="19"/>
+                <w:szCs w:val="19"/>
+              </w:rPr>
+              <w:t>, 2), OUSL alert (TC-106), blocked hosts never linked by Ask (ASK-047)</w:t>
             </w:r>
           </w:p>
         </w:tc>
@@ -9410,7 +9394,7 @@
                 <w:sz w:val="19"/>
                 <w:szCs w:val="19"/>
               </w:rPr>
-              <w:t>CR-012, 23 October</w:t>
+              <w:t>CR-012 revised, 23 October</w:t>
             </w:r>
           </w:p>
         </w:tc>
@@ -9441,7 +9425,7 @@
                 <w:sz w:val="19"/>
                 <w:szCs w:val="19"/>
               </w:rPr>
-              <w:t xml:space="preserve">38 files (37 passed, 1 opt-in skipped); 568 tests: </w:t>
+              <w:t xml:space="preserve">38 files; 570 tests: </w:t>
             </w:r>
             <w:r>
               <w:rPr>
@@ -9450,14 +9434,14 @@
                 <w:sz w:val="19"/>
                 <w:szCs w:val="19"/>
               </w:rPr>
-              <w:t>547 passed, 0 failed</w:t>
-            </w:r>
-            <w:r>
-              <w:rPr>
-                <w:sz w:val="19"/>
-                <w:szCs w:val="19"/>
-              </w:rPr>
-              <w:t xml:space="preserve">; new </w:t>
+              <w:t>549 passed, 0 failed</w:t>
+            </w:r>
+            <w:r>
+              <w:rPr>
+                <w:sz w:val="19"/>
+                <w:szCs w:val="19"/>
+              </w:rPr>
+              <w:t xml:space="preserve">; </w:t>
             </w:r>
             <w:r>
               <w:rPr>
@@ -9473,7 +9457,7 @@
                 <w:sz w:val="19"/>
                 <w:szCs w:val="19"/>
               </w:rPr>
-              <w:t xml:space="preserve"> (4), TC-142</w:t>
+              <w:t xml:space="preserve"> now 6</w:t>
             </w:r>
           </w:p>
         </w:tc>
@@ -9514,7 +9498,7 @@
                 <w:sz w:val="19"/>
                 <w:szCs w:val="19"/>
               </w:rPr>
-              <w:t>CR-011, 23 October</w:t>
+              <w:t>CR-012, 23 October</w:t>
             </w:r>
           </w:p>
         </w:tc>
@@ -9544,7 +9528,7 @@
                 <w:sz w:val="19"/>
                 <w:szCs w:val="19"/>
               </w:rPr>
-              <w:t xml:space="preserve">37 files (36 passed, 1 opt-in skipped); 564 tests: </w:t>
+              <w:t xml:space="preserve">38 files (37 passed, 1 opt-in skipped); 568 tests: </w:t>
             </w:r>
             <w:r>
               <w:rPr>
@@ -9553,7 +9537,7 @@
                 <w:sz w:val="19"/>
                 <w:szCs w:val="19"/>
               </w:rPr>
-              <w:t>543 passed, 0 failed</w:t>
+              <w:t>547 passed, 0 failed</w:t>
             </w:r>
             <w:r>
               <w:rPr>
@@ -9569,14 +9553,14 @@
                 <w:szCs w:val="17"/>
                 <w:shd w:val="clear" w:color="auto" w:fill="F2F4F3"/>
               </w:rPr>
-              <w:t>src/list-guide.test.ts</w:t>
-            </w:r>
-            <w:r>
-              <w:rPr>
-                <w:sz w:val="19"/>
-                <w:szCs w:val="19"/>
-              </w:rPr>
-              <w:t xml:space="preserve"> (4), TC-141</w:t>
+              <w:t>src/apply.test.ts</w:t>
+            </w:r>
+            <w:r>
+              <w:rPr>
+                <w:sz w:val="19"/>
+                <w:szCs w:val="19"/>
+              </w:rPr>
+              <w:t xml:space="preserve"> (4), TC-142</w:t>
             </w:r>
           </w:p>
         </w:tc>
@@ -9618,7 +9602,7 @@
                 <w:sz w:val="19"/>
                 <w:szCs w:val="19"/>
               </w:rPr>
-              <w:t>Update of 23 October</w:t>
+              <w:t>CR-011, 23 October</w:t>
             </w:r>
           </w:p>
         </w:tc>
@@ -9649,7 +9633,7 @@
                 <w:sz w:val="19"/>
                 <w:szCs w:val="19"/>
               </w:rPr>
-              <w:t xml:space="preserve">36 files (35 passed, 1 opt-in skipped); 560 tests: </w:t>
+              <w:t xml:space="preserve">37 files (36 passed, 1 opt-in skipped); 564 tests: </w:t>
             </w:r>
             <w:r>
               <w:rPr>
@@ -9658,7 +9642,7 @@
                 <w:sz w:val="19"/>
                 <w:szCs w:val="19"/>
               </w:rPr>
-              <w:t>539 passed, 0 failed</w:t>
+              <w:t>543 passed, 0 failed</w:t>
             </w:r>
             <w:r>
               <w:rPr>
@@ -9674,14 +9658,14 @@
                 <w:szCs w:val="17"/>
                 <w:shd w:val="clear" w:color="auto" w:fill="F2F4F3"/>
               </w:rPr>
-              <w:t>src/list-feedback.test.ts</w:t>
-            </w:r>
-            <w:r>
-              <w:rPr>
-                <w:sz w:val="19"/>
-                <w:szCs w:val="19"/>
-              </w:rPr>
-              <w:t xml:space="preserve"> (3), TC-140</w:t>
+              <w:t>src/list-guide.test.ts</w:t>
+            </w:r>
+            <w:r>
+              <w:rPr>
+                <w:sz w:val="19"/>
+                <w:szCs w:val="19"/>
+              </w:rPr>
+              <w:t xml:space="preserve"> (4), TC-141</w:t>
             </w:r>
           </w:p>
         </w:tc>
@@ -9722,7 +9706,7 @@
                 <w:sz w:val="19"/>
                 <w:szCs w:val="19"/>
               </w:rPr>
-              <w:t>New test file</w:t>
+              <w:t>Update of 23 October</w:t>
             </w:r>
           </w:p>
         </w:tc>
@@ -9747,6 +9731,29 @@
             <w:pPr>
               <w:spacing w:line="252" w:lineRule="auto"/>
             </w:pPr>
+            <w:r>
+              <w:rPr>
+                <w:sz w:val="19"/>
+                <w:szCs w:val="19"/>
+              </w:rPr>
+              <w:t xml:space="preserve">36 files (35 passed, 1 opt-in skipped); 560 tests: </w:t>
+            </w:r>
+            <w:r>
+              <w:rPr>
+                <w:b/>
+                <w:bCs/>
+                <w:sz w:val="19"/>
+                <w:szCs w:val="19"/>
+              </w:rPr>
+              <w:t>539 passed, 0 failed</w:t>
+            </w:r>
+            <w:r>
+              <w:rPr>
+                <w:sz w:val="19"/>
+                <w:szCs w:val="19"/>
+              </w:rPr>
+              <w:t xml:space="preserve">; new </w:t>
+            </w:r>
             <w:r>
               <w:rPr>
                 <w:rFonts w:ascii="Consolas" w:eastAsia="Consolas" w:hAnsi="Consolas" w:cs="Consolas"/>
@@ -9754,14 +9761,14 @@
                 <w:szCs w:val="17"/>
                 <w:shd w:val="clear" w:color="auto" w:fill="F2F4F3"/>
               </w:rPr>
-              <w:t>src/nav-pref.test.ts</w:t>
-            </w:r>
-            <w:r>
-              <w:rPr>
-                <w:sz w:val="19"/>
-                <w:szCs w:val="19"/>
-              </w:rPr>
-              <w:t xml:space="preserve"> (4): the desktop side menu is open by default, remembered per device, safe when storage is blocked, forgotten by "Clear this phone" (TC-139)</w:t>
+              <w:t>src/list-feedback.test.ts</w:t>
+            </w:r>
+            <w:r>
+              <w:rPr>
+                <w:sz w:val="19"/>
+                <w:szCs w:val="19"/>
+              </w:rPr>
+              <w:t xml:space="preserve"> (3), TC-140</w:t>
             </w:r>
           </w:p>
         </w:tc>
@@ -9800,43 +9807,50 @@
             </w:pPr>
             <w:r>
               <w:rPr>
+                <w:sz w:val="19"/>
+                <w:szCs w:val="19"/>
+              </w:rPr>
+              <w:t>New test file</w:t>
+            </w:r>
+          </w:p>
+        </w:tc>
+        <w:tc>
+          <w:tcPr>
+            <w:tcW w:w="5522" w:type="dxa"/>
+            <w:tcBorders>
+              <w:top w:val="single" w:sz="4" w:space="0" w:color="C9D3D0"/>
+              <w:left w:val="single" w:sz="4" w:space="0" w:color="C9D3D0"/>
+              <w:bottom w:val="single" w:sz="4" w:space="0" w:color="C9D3D0"/>
+              <w:right w:val="single" w:sz="4" w:space="0" w:color="C9D3D0"/>
+            </w:tcBorders>
+            <w:shd w:val="clear" w:color="auto" w:fill="F3F8F6"/>
+            <w:tcMar>
+              <w:top w:w="50" w:type="dxa"/>
+              <w:left w:w="100" w:type="dxa"/>
+              <w:bottom w:w="50" w:type="dxa"/>
+              <w:right w:w="100" w:type="dxa"/>
+            </w:tcMar>
+            <w:vAlign w:val="center"/>
+          </w:tcPr>
+          <w:p>
+            <w:pPr>
+              <w:spacing w:line="252" w:lineRule="auto"/>
+            </w:pPr>
+            <w:r>
+              <w:rPr>
                 <w:rFonts w:ascii="Consolas" w:eastAsia="Consolas" w:hAnsi="Consolas" w:cs="Consolas"/>
                 <w:sz w:val="17"/>
                 <w:szCs w:val="17"/>
                 <w:shd w:val="clear" w:color="auto" w:fill="F2F4F3"/>
               </w:rPr>
-              <w:t>npx tsc -b</w:t>
-            </w:r>
-          </w:p>
-        </w:tc>
-        <w:tc>
-          <w:tcPr>
-            <w:tcW w:w="5522" w:type="dxa"/>
-            <w:tcBorders>
-              <w:top w:val="single" w:sz="4" w:space="0" w:color="C9D3D0"/>
-              <w:left w:val="single" w:sz="4" w:space="0" w:color="C9D3D0"/>
-              <w:bottom w:val="single" w:sz="4" w:space="0" w:color="C9D3D0"/>
-              <w:right w:val="single" w:sz="4" w:space="0" w:color="C9D3D0"/>
-            </w:tcBorders>
-            <w:shd w:val="clear" w:color="auto" w:fill="F3F8F6"/>
-            <w:tcMar>
-              <w:top w:w="50" w:type="dxa"/>
-              <w:left w:w="100" w:type="dxa"/>
-              <w:bottom w:w="50" w:type="dxa"/>
-              <w:right w:w="100" w:type="dxa"/>
-            </w:tcMar>
-            <w:vAlign w:val="center"/>
-          </w:tcPr>
-          <w:p>
-            <w:pPr>
-              <w:spacing w:line="252" w:lineRule="auto"/>
-            </w:pPr>
-            <w:r>
-              <w:rPr>
-                <w:sz w:val="19"/>
-                <w:szCs w:val="19"/>
-              </w:rPr>
-              <w:t>Exit code 0</w:t>
+              <w:t>src/nav-pref.test.ts</w:t>
+            </w:r>
+            <w:r>
+              <w:rPr>
+                <w:sz w:val="19"/>
+                <w:szCs w:val="19"/>
+              </w:rPr>
+              <w:t xml:space="preserve"> (4): the desktop side menu is open by default, remembered per device, safe when storage is blocked, forgotten by "Clear this phone" (TC-139)</w:t>
             </w:r>
           </w:p>
         </w:tc>
@@ -9879,6 +9893,80 @@
                 <w:szCs w:val="17"/>
                 <w:shd w:val="clear" w:color="auto" w:fill="F2F4F3"/>
               </w:rPr>
+              <w:t>npx tsc -b</w:t>
+            </w:r>
+          </w:p>
+        </w:tc>
+        <w:tc>
+          <w:tcPr>
+            <w:tcW w:w="5522" w:type="dxa"/>
+            <w:tcBorders>
+              <w:top w:val="single" w:sz="4" w:space="0" w:color="C9D3D0"/>
+              <w:left w:val="single" w:sz="4" w:space="0" w:color="C9D3D0"/>
+              <w:bottom w:val="single" w:sz="4" w:space="0" w:color="C9D3D0"/>
+              <w:right w:val="single" w:sz="4" w:space="0" w:color="C9D3D0"/>
+            </w:tcBorders>
+            <w:tcMar>
+              <w:top w:w="50" w:type="dxa"/>
+              <w:left w:w="100" w:type="dxa"/>
+              <w:bottom w:w="50" w:type="dxa"/>
+              <w:right w:w="100" w:type="dxa"/>
+            </w:tcMar>
+            <w:vAlign w:val="center"/>
+          </w:tcPr>
+          <w:p>
+            <w:pPr>
+              <w:spacing w:line="252" w:lineRule="auto"/>
+            </w:pPr>
+            <w:r>
+              <w:rPr>
+                <w:sz w:val="19"/>
+                <w:szCs w:val="19"/>
+              </w:rPr>
+              <w:t>Exit code 0</w:t>
+            </w:r>
+          </w:p>
+        </w:tc>
+      </w:tr>
+      <w:tr>
+        <w:tblPrEx>
+          <w:tblCellMar>
+            <w:top w:w="0" w:type="dxa"/>
+            <w:bottom w:w="0" w:type="dxa"/>
+          </w:tblCellMar>
+        </w:tblPrEx>
+        <w:trPr>
+          <w:cantSplit/>
+        </w:trPr>
+        <w:tc>
+          <w:tcPr>
+            <w:tcW w:w="4116" w:type="dxa"/>
+            <w:tcBorders>
+              <w:top w:val="single" w:sz="4" w:space="0" w:color="C9D3D0"/>
+              <w:left w:val="single" w:sz="4" w:space="0" w:color="C9D3D0"/>
+              <w:bottom w:val="single" w:sz="4" w:space="0" w:color="C9D3D0"/>
+              <w:right w:val="single" w:sz="4" w:space="0" w:color="C9D3D0"/>
+            </w:tcBorders>
+            <w:shd w:val="clear" w:color="auto" w:fill="F3F8F6"/>
+            <w:tcMar>
+              <w:top w:w="50" w:type="dxa"/>
+              <w:left w:w="100" w:type="dxa"/>
+              <w:bottom w:w="50" w:type="dxa"/>
+              <w:right w:w="100" w:type="dxa"/>
+            </w:tcMar>
+            <w:vAlign w:val="center"/>
+          </w:tcPr>
+          <w:p>
+            <w:pPr>
+              <w:spacing w:line="252" w:lineRule="auto"/>
+            </w:pPr>
+            <w:r>
+              <w:rPr>
+                <w:rFonts w:ascii="Consolas" w:eastAsia="Consolas" w:hAnsi="Consolas" w:cs="Consolas"/>
+                <w:sz w:val="17"/>
+                <w:szCs w:val="17"/>
+                <w:shd w:val="clear" w:color="auto" w:fill="F2F4F3"/>
+              </w:rPr>
               <w:t>bash .claude/hooks/test-guard.sh</w:t>
             </w:r>
           </w:p>
@@ -9892,6 +9980,7 @@
               <w:bottom w:val="single" w:sz="4" w:space="0" w:color="C9D3D0"/>
               <w:right w:val="single" w:sz="4" w:space="0" w:color="C9D3D0"/>
             </w:tcBorders>
+            <w:shd w:val="clear" w:color="auto" w:fill="F3F8F6"/>
             <w:tcMar>
               <w:top w:w="50" w:type="dxa"/>
               <w:left w:w="100" w:type="dxa"/>
@@ -9926,7 +10015,7 @@
         <w:keepNext/>
         <w:keepLines/>
       </w:pPr>
-      <w:bookmarkStart w:id="11" w:name="_Toc243672269"/>
+      <w:bookmarkStart w:id="11" w:name="_Toc243678870"/>
       <w:r>
         <w:lastRenderedPageBreak/>
         <w:t>2.3 What the campaign proves</w:t>
@@ -9938,7 +10027,7 @@
         <w:pStyle w:val="Caption"/>
         <w:keepNext/>
       </w:pPr>
-      <w:bookmarkStart w:id="12" w:name="_Toc243672282"/>
+      <w:bookmarkStart w:id="12" w:name="_Toc243678883"/>
       <w:r>
         <w:t xml:space="preserve">Table </w:t>
       </w:r>
@@ -9980,7 +10069,7 @@
           <w:left w:w="10" w:type="dxa"/>
           <w:right w:w="10" w:type="dxa"/>
         </w:tblCellMar>
-        <w:tblLook w:val="04A0" w:firstRow="1" w:lastRow="0" w:firstColumn="1" w:lastColumn="0" w:noHBand="0" w:noVBand="1"/>
+        <w:tblLook w:val="0000" w:firstRow="0" w:lastRow="0" w:firstColumn="0" w:lastColumn="0" w:noHBand="0" w:noVBand="0"/>
       </w:tblPr>
       <w:tblGrid>
         <w:gridCol w:w="4819"/>
@@ -10799,7 +10888,7 @@
         <w:keepLines/>
         <w:pageBreakBefore/>
       </w:pPr>
-      <w:bookmarkStart w:id="13" w:name="_Toc243672270"/>
+      <w:bookmarkStart w:id="13" w:name="_Toc243678871"/>
       <w:r>
         <w:lastRenderedPageBreak/>
         <w:t>3 Defects and findings</w:t>
@@ -10811,10 +10900,7 @@
         <w:spacing w:after="120"/>
       </w:pPr>
       <w:r>
-        <w:t xml:space="preserve">Severity: High = wrong result or data exposure; Medium = visible to students or a security weakness without data exposure; Low = cosmetic, performance or tooling. None of the findings exposes data or gives a wrong course </w:t>
-      </w:r>
-      <w:r>
-        <w:t>result.</w:t>
+        <w:t>Severity: High = wrong result or data exposure; Medium = visible to students or a security weakness without data exposure; Low = cosmetic, performance or tooling. None of the findings exposes data or gives a wrong course result.</w:t>
       </w:r>
     </w:p>
     <w:p>
@@ -10822,7 +10908,7 @@
         <w:pStyle w:val="Caption"/>
         <w:keepNext/>
       </w:pPr>
-      <w:bookmarkStart w:id="14" w:name="_Toc243672283"/>
+      <w:bookmarkStart w:id="14" w:name="_Toc243678884"/>
       <w:r>
         <w:t xml:space="preserve">Table </w:t>
       </w:r>
@@ -10864,7 +10950,7 @@
           <w:left w:w="10" w:type="dxa"/>
           <w:right w:w="10" w:type="dxa"/>
         </w:tblCellMar>
-        <w:tblLook w:val="04A0" w:firstRow="1" w:lastRow="0" w:firstColumn="1" w:lastColumn="0" w:noHBand="0" w:noVBand="1"/>
+        <w:tblLook w:val="0000" w:firstRow="0" w:lastRow="0" w:firstColumn="0" w:lastColumn="0" w:noHBand="0" w:noVBand="0"/>
       </w:tblPr>
       <w:tblGrid>
         <w:gridCol w:w="591"/>
@@ -13350,7 +13436,7 @@
         <w:keepNext/>
         <w:keepLines/>
       </w:pPr>
-      <w:bookmarkStart w:id="15" w:name="_Toc243672271"/>
+      <w:bookmarkStart w:id="15" w:name="_Toc243678872"/>
       <w:r>
         <w:t>3.1 Failures that are not application defects</w:t>
       </w:r>
@@ -13361,7 +13447,7 @@
         <w:pStyle w:val="Caption"/>
         <w:keepNext/>
       </w:pPr>
-      <w:bookmarkStart w:id="16" w:name="_Toc243672284"/>
+      <w:bookmarkStart w:id="16" w:name="_Toc243678885"/>
       <w:r>
         <w:t xml:space="preserve">Table </w:t>
       </w:r>
@@ -13403,7 +13489,7 @@
           <w:left w:w="10" w:type="dxa"/>
           <w:right w:w="10" w:type="dxa"/>
         </w:tblCellMar>
-        <w:tblLook w:val="04A0" w:firstRow="1" w:lastRow="0" w:firstColumn="1" w:lastColumn="0" w:noHBand="0" w:noVBand="1"/>
+        <w:tblLook w:val="0000" w:firstRow="0" w:lastRow="0" w:firstColumn="0" w:lastColumn="0" w:noHBand="0" w:noVBand="0"/>
       </w:tblPr>
       <w:tblGrid>
         <w:gridCol w:w="1342"/>
@@ -13742,7 +13828,7 @@
         <w:keepLines/>
         <w:pageBreakBefore/>
       </w:pPr>
-      <w:bookmarkStart w:id="17" w:name="_Toc243672272"/>
+      <w:bookmarkStart w:id="17" w:name="_Toc243678873"/>
       <w:r>
         <w:lastRenderedPageBreak/>
         <w:t>4 Security audit run-1</w:t>
@@ -13755,7 +13841,7 @@
         <w:keepNext/>
         <w:keepLines/>
       </w:pPr>
-      <w:bookmarkStart w:id="18" w:name="_Toc243672273"/>
+      <w:bookmarkStart w:id="18" w:name="_Toc243678874"/>
       <w:r>
         <w:t>4.1 Method</w:t>
       </w:r>
@@ -13798,7 +13884,7 @@
         <w:keepNext/>
         <w:keepLines/>
       </w:pPr>
-      <w:bookmarkStart w:id="19" w:name="_Toc243672274"/>
+      <w:bookmarkStart w:id="19" w:name="_Toc243678875"/>
       <w:r>
         <w:t>4.2 Results</w:t>
       </w:r>
@@ -13809,7 +13895,7 @@
         <w:pStyle w:val="Caption"/>
         <w:keepNext/>
       </w:pPr>
-      <w:bookmarkStart w:id="20" w:name="_Toc243672285"/>
+      <w:bookmarkStart w:id="20" w:name="_Toc243678886"/>
       <w:r>
         <w:t xml:space="preserve">Table </w:t>
       </w:r>
@@ -13851,7 +13937,7 @@
           <w:left w:w="10" w:type="dxa"/>
           <w:right w:w="10" w:type="dxa"/>
         </w:tblCellMar>
-        <w:tblLook w:val="04A0" w:firstRow="1" w:lastRow="0" w:firstColumn="1" w:lastColumn="0" w:noHBand="0" w:noVBand="1"/>
+        <w:tblLook w:val="0000" w:firstRow="0" w:lastRow="0" w:firstColumn="0" w:lastColumn="0" w:noHBand="0" w:noVBand="0"/>
       </w:tblPr>
       <w:tblGrid>
         <w:gridCol w:w="2966"/>
@@ -14163,7 +14249,7 @@
         <w:pStyle w:val="Caption"/>
         <w:keepNext/>
       </w:pPr>
-      <w:bookmarkStart w:id="21" w:name="_Toc243672286"/>
+      <w:bookmarkStart w:id="21" w:name="_Toc243678887"/>
       <w:r>
         <w:t xml:space="preserve">Table </w:t>
       </w:r>
@@ -14205,7 +14291,7 @@
           <w:left w:w="10" w:type="dxa"/>
           <w:right w:w="10" w:type="dxa"/>
         </w:tblCellMar>
-        <w:tblLook w:val="04A0" w:firstRow="1" w:lastRow="0" w:firstColumn="1" w:lastColumn="0" w:noHBand="0" w:noVBand="1"/>
+        <w:tblLook w:val="0000" w:firstRow="0" w:lastRow="0" w:firstColumn="0" w:lastColumn="0" w:noHBand="0" w:noVBand="0"/>
       </w:tblPr>
       <w:tblGrid>
         <w:gridCol w:w="746"/>
@@ -16753,7 +16839,7 @@
         <w:keepLines/>
         <w:pageBreakBefore/>
       </w:pPr>
-      <w:bookmarkStart w:id="22" w:name="_Toc243672275"/>
+      <w:bookmarkStart w:id="22" w:name="_Toc243678876"/>
       <w:r>
         <w:lastRenderedPageBreak/>
         <w:t>5 Limits of this campaign</w:t>
@@ -16843,7 +16929,7 @@
         <w:keepLines/>
         <w:pageBreakBefore/>
       </w:pPr>
-      <w:bookmarkStart w:id="23" w:name="_Toc243672276"/>
+      <w:bookmarkStart w:id="23" w:name="_Toc243678877"/>
       <w:r>
         <w:lastRenderedPageBreak/>
         <w:t>6 Conclusion</w:t>
@@ -16878,7 +16964,7 @@
         <w:keepLines/>
         <w:pageBreakBefore/>
       </w:pPr>
-      <w:bookmarkStart w:id="24" w:name="_Toc243672277"/>
+      <w:bookmarkStart w:id="24" w:name="_Toc243678878"/>
       <w:r>
         <w:lastRenderedPageBreak/>
         <w:t>7 Appendix A. Result files</w:t>
@@ -17149,10 +17235,134 @@
 <file path=word/numbering.xml><?xml version="1.0" encoding="utf-8"?>
 <w:numbering xmlns:wpc="http://schemas.microsoft.com/office/word/2010/wordprocessingCanvas" xmlns:cx="http://schemas.microsoft.com/office/drawing/2014/chartex" xmlns:cx1="http://schemas.microsoft.com/office/drawing/2015/9/8/chartex" xmlns:cx2="http://schemas.microsoft.com/office/drawing/2015/10/21/chartex" xmlns:cx3="http://schemas.microsoft.com/office/drawing/2016/5/9/chartex" xmlns:cx4="http://schemas.microsoft.com/office/drawing/2016/5/10/chartex" xmlns:cx5="http://schemas.microsoft.com/office/drawing/2016/5/11/chartex" xmlns:cx6="http://schemas.microsoft.com/office/drawing/2016/5/12/chartex" xmlns:cx7="http://schemas.microsoft.com/office/drawing/2016/5/13/chartex" xmlns:cx8="http://schemas.microsoft.com/office/drawing/2016/5/14/chartex" xmlns:mc="http://schemas.openxmlformats.org/markup-compatibility/2006" xmlns:aink="http://schemas.microsoft.com/office/drawing/2016/ink" xmlns:am3d="http://schemas.microsoft.com/office/drawing/2017/model3d" xmlns:o="urn:schemas-microsoft-com:office:office" xmlns:oel="http://schemas.microsoft.com/office/2019/extlst" xmlns:r="http://schemas.openxmlformats.org/officeDocument/2006/relationships" xmlns:m="http://schemas.openxmlformats.org/officeDocument/2006/math" xmlns:v="urn:schemas-microsoft-com:vml" xmlns:wp14="http://schemas.microsoft.com/office/word/2010/wordprocessingDrawing" xmlns:wp="http://schemas.openxmlformats.org/drawingml/2006/wordprocessingDrawing" xmlns:w10="urn:schemas-microsoft-com:office:word" xmlns:w="http://schemas.openxmlformats.org/wordprocessingml/2006/main" xmlns:w14="http://schemas.microsoft.com/office/word/2010/wordml" xmlns:w15="http://schemas.microsoft.com/office/word/2012/wordml" xmlns:w16cex="http://schemas.microsoft.com/office/word/2018/wordml/cex" xmlns:w16cid="http://schemas.microsoft.com/office/word/2016/wordml/cid" xmlns:w16="http://schemas.microsoft.com/office/word/2018/wordml" xmlns:w16du="http://schemas.microsoft.com/office/word/2023/wordml/word16du" xmlns:w16sdtdh="http://schemas.microsoft.com/office/word/2020/wordml/sdtdatahash" xmlns:w16sdtfl="http://schemas.microsoft.com/office/word/2024/wordml/sdtformatlock" xmlns:w16se="http://schemas.microsoft.com/office/word/2015/wordml/symex" xmlns:wpg="http://schemas.microsoft.com/office/word/2010/wordprocessingGroup" xmlns:wpi="http://schemas.microsoft.com/office/word/2010/wordprocessingInk" xmlns:wne="http://schemas.microsoft.com/office/word/2006/wordml" xmlns:wps="http://schemas.microsoft.com/office/word/2010/wordprocessingShape" mc:Ignorable="w14 w15 w16se w16cid w16 w16cex w16sdtdh w16sdtfl w16du wp14">
   <w:abstractNum w:abstractNumId="0" w15:restartNumberingAfterBreak="0">
-    <w:nsid w:val="66C25BD0"/>
+    <w:nsid w:val="40791EC1"/>
     <w:multiLevelType w:val="hybridMultilevel"/>
-    <w:tmpl w:val="1484868E"/>
-    <w:lvl w:ilvl="0" w:tplc="9B884BC4" w:tentative="1">
+    <w:tmpl w:val="2C9CD6EA"/>
+    <w:lvl w:ilvl="0" w:tplc="79E48450">
+      <w:start w:val="1"/>
+      <w:numFmt w:val="bullet"/>
+      <w:lvlText w:val="•"/>
+      <w:lvlJc w:val="left"/>
+      <w:pPr>
+        <w:ind w:left="720" w:hanging="280"/>
+      </w:pPr>
+    </w:lvl>
+    <w:lvl w:ilvl="1" w:tplc="61F67B1E" w:tentative="1">
+      <w:start w:val="1"/>
+      <w:numFmt w:val="bullet"/>
+      <w:lvlText w:val="–"/>
+      <w:lvlJc w:val="left"/>
+      <w:pPr>
+        <w:ind w:left="1080" w:hanging="280"/>
+      </w:pPr>
+    </w:lvl>
+    <w:lvl w:ilvl="2" w:tplc="ABEE4F10" w:tentative="1">
+      <w:start w:val="1"/>
+      <w:numFmt w:val="bullet"/>
+      <w:lvlText w:val="▪"/>
+      <w:lvlJc w:val="left"/>
+      <w:pPr>
+        <w:ind w:left="1440" w:hanging="280"/>
+      </w:pPr>
+    </w:lvl>
+    <w:lvl w:ilvl="3" w:tplc="723E3E3A">
+      <w:numFmt w:val="decimal"/>
+      <w:lvlText w:val=""/>
+      <w:lvlJc w:val="left"/>
+    </w:lvl>
+    <w:lvl w:ilvl="4" w:tplc="8C587E58">
+      <w:numFmt w:val="decimal"/>
+      <w:lvlText w:val=""/>
+      <w:lvlJc w:val="left"/>
+    </w:lvl>
+    <w:lvl w:ilvl="5" w:tplc="71EE12F4">
+      <w:numFmt w:val="decimal"/>
+      <w:lvlText w:val=""/>
+      <w:lvlJc w:val="left"/>
+    </w:lvl>
+    <w:lvl w:ilvl="6" w:tplc="A1060800">
+      <w:numFmt w:val="decimal"/>
+      <w:lvlText w:val=""/>
+      <w:lvlJc w:val="left"/>
+    </w:lvl>
+    <w:lvl w:ilvl="7" w:tplc="5172EA8A">
+      <w:numFmt w:val="decimal"/>
+      <w:lvlText w:val=""/>
+      <w:lvlJc w:val="left"/>
+    </w:lvl>
+    <w:lvl w:ilvl="8" w:tplc="75CA2966">
+      <w:numFmt w:val="decimal"/>
+      <w:lvlText w:val=""/>
+      <w:lvlJc w:val="left"/>
+    </w:lvl>
+  </w:abstractNum>
+  <w:abstractNum w:abstractNumId="1" w15:restartNumberingAfterBreak="0">
+    <w:nsid w:val="5B3A112F"/>
+    <w:multiLevelType w:val="hybridMultilevel"/>
+    <w:tmpl w:val="E3469AE8"/>
+    <w:lvl w:ilvl="0" w:tplc="361085C8" w:tentative="1">
+      <w:start w:val="1"/>
+      <w:numFmt w:val="decimal"/>
+      <w:lvlText w:val="%1."/>
+      <w:lvlJc w:val="left"/>
+      <w:pPr>
+        <w:ind w:left="720" w:hanging="360"/>
+      </w:pPr>
+    </w:lvl>
+    <w:lvl w:ilvl="1" w:tplc="E30CCEE6" w:tentative="1">
+      <w:start w:val="1"/>
+      <w:numFmt w:val="lowerLetter"/>
+      <w:lvlText w:val="%2."/>
+      <w:lvlJc w:val="left"/>
+      <w:pPr>
+        <w:ind w:left="1080" w:hanging="360"/>
+      </w:pPr>
+    </w:lvl>
+    <w:lvl w:ilvl="2" w:tplc="D1A069EA" w:tentative="1">
+      <w:start w:val="1"/>
+      <w:numFmt w:val="lowerRoman"/>
+      <w:lvlText w:val="%3."/>
+      <w:lvlJc w:val="left"/>
+      <w:pPr>
+        <w:ind w:left="1440" w:hanging="360"/>
+      </w:pPr>
+    </w:lvl>
+    <w:lvl w:ilvl="3" w:tplc="B554C4E6">
+      <w:numFmt w:val="decimal"/>
+      <w:lvlText w:val=""/>
+      <w:lvlJc w:val="left"/>
+    </w:lvl>
+    <w:lvl w:ilvl="4" w:tplc="5BB805E8">
+      <w:numFmt w:val="decimal"/>
+      <w:lvlText w:val=""/>
+      <w:lvlJc w:val="left"/>
+    </w:lvl>
+    <w:lvl w:ilvl="5" w:tplc="FB904F9A">
+      <w:numFmt w:val="decimal"/>
+      <w:lvlText w:val=""/>
+      <w:lvlJc w:val="left"/>
+    </w:lvl>
+    <w:lvl w:ilvl="6" w:tplc="59F0C046">
+      <w:numFmt w:val="decimal"/>
+      <w:lvlText w:val=""/>
+      <w:lvlJc w:val="left"/>
+    </w:lvl>
+    <w:lvl w:ilvl="7" w:tplc="CA88582A">
+      <w:numFmt w:val="decimal"/>
+      <w:lvlText w:val=""/>
+      <w:lvlJc w:val="left"/>
+    </w:lvl>
+    <w:lvl w:ilvl="8" w:tplc="A386C54A">
+      <w:numFmt w:val="decimal"/>
+      <w:lvlText w:val=""/>
+      <w:lvlJc w:val="left"/>
+    </w:lvl>
+  </w:abstractNum>
+  <w:abstractNum w:abstractNumId="2" w15:restartNumberingAfterBreak="0">
+    <w:nsid w:val="5EE82998"/>
+    <w:multiLevelType w:val="hybridMultilevel"/>
+    <w:tmpl w:val="B23ACBFC"/>
+    <w:lvl w:ilvl="0" w:tplc="0A98D710" w:tentative="1">
       <w:start w:val="1"/>
       <w:numFmt w:val="bullet"/>
       <w:lvlText w:val="●"/>
@@ -17161,7 +17371,7 @@
         <w:ind w:left="720" w:hanging="360"/>
       </w:pPr>
     </w:lvl>
-    <w:lvl w:ilvl="1" w:tplc="EFFEA86A" w:tentative="1">
+    <w:lvl w:ilvl="1" w:tplc="1844410A" w:tentative="1">
       <w:start w:val="1"/>
       <w:numFmt w:val="bullet"/>
       <w:lvlText w:val="○"/>
@@ -17170,7 +17380,7 @@
         <w:ind w:left="1440" w:hanging="360"/>
       </w:pPr>
     </w:lvl>
-    <w:lvl w:ilvl="2" w:tplc="9ACAAFF2" w:tentative="1">
+    <w:lvl w:ilvl="2" w:tplc="93386910" w:tentative="1">
       <w:start w:val="1"/>
       <w:numFmt w:val="bullet"/>
       <w:lvlText w:val="■"/>
@@ -17179,7 +17389,7 @@
         <w:ind w:left="2160" w:hanging="360"/>
       </w:pPr>
     </w:lvl>
-    <w:lvl w:ilvl="3" w:tplc="5BCC313A" w:tentative="1">
+    <w:lvl w:ilvl="3" w:tplc="10D28CEC" w:tentative="1">
       <w:start w:val="1"/>
       <w:numFmt w:val="bullet"/>
       <w:lvlText w:val="●"/>
@@ -17188,7 +17398,7 @@
         <w:ind w:left="2880" w:hanging="360"/>
       </w:pPr>
     </w:lvl>
-    <w:lvl w:ilvl="4" w:tplc="0C7A1A5A" w:tentative="1">
+    <w:lvl w:ilvl="4" w:tplc="A4108346" w:tentative="1">
       <w:start w:val="1"/>
       <w:numFmt w:val="bullet"/>
       <w:lvlText w:val="○"/>
@@ -17197,7 +17407,7 @@
         <w:ind w:left="3600" w:hanging="360"/>
       </w:pPr>
     </w:lvl>
-    <w:lvl w:ilvl="5" w:tplc="4B207E8C" w:tentative="1">
+    <w:lvl w:ilvl="5" w:tplc="9DAEA868" w:tentative="1">
       <w:start w:val="1"/>
       <w:numFmt w:val="bullet"/>
       <w:lvlText w:val="■"/>
@@ -17206,7 +17416,7 @@
         <w:ind w:left="4320" w:hanging="360"/>
       </w:pPr>
     </w:lvl>
-    <w:lvl w:ilvl="6" w:tplc="69321BCA" w:tentative="1">
+    <w:lvl w:ilvl="6" w:tplc="364EA574" w:tentative="1">
       <w:start w:val="1"/>
       <w:numFmt w:val="bullet"/>
       <w:lvlText w:val="●"/>
@@ -17215,7 +17425,7 @@
         <w:ind w:left="5040" w:hanging="360"/>
       </w:pPr>
     </w:lvl>
-    <w:lvl w:ilvl="7" w:tplc="6652B520" w:tentative="1">
+    <w:lvl w:ilvl="7" w:tplc="CEC03134" w:tentative="1">
       <w:start w:val="1"/>
       <w:numFmt w:val="bullet"/>
       <w:lvlText w:val="●"/>
@@ -17224,7 +17434,7 @@
         <w:ind w:left="5760" w:hanging="360"/>
       </w:pPr>
     </w:lvl>
-    <w:lvl w:ilvl="8" w:tplc="367A775E" w:tentative="1">
+    <w:lvl w:ilvl="8" w:tplc="272C390E" w:tentative="1">
       <w:start w:val="1"/>
       <w:numFmt w:val="bullet"/>
       <w:lvlText w:val="●"/>
@@ -17234,138 +17444,14 @@
       </w:pPr>
     </w:lvl>
   </w:abstractNum>
-  <w:abstractNum w:abstractNumId="1" w15:restartNumberingAfterBreak="0">
-    <w:nsid w:val="709F4D8C"/>
-    <w:multiLevelType w:val="hybridMultilevel"/>
-    <w:tmpl w:val="589CC6FA"/>
-    <w:lvl w:ilvl="0" w:tplc="E662E53C" w:tentative="1">
-      <w:start w:val="1"/>
-      <w:numFmt w:val="decimal"/>
-      <w:lvlText w:val="%1."/>
-      <w:lvlJc w:val="left"/>
-      <w:pPr>
-        <w:ind w:left="720" w:hanging="360"/>
-      </w:pPr>
-    </w:lvl>
-    <w:lvl w:ilvl="1" w:tplc="BEA8E072" w:tentative="1">
-      <w:start w:val="1"/>
-      <w:numFmt w:val="lowerLetter"/>
-      <w:lvlText w:val="%2."/>
-      <w:lvlJc w:val="left"/>
-      <w:pPr>
-        <w:ind w:left="1080" w:hanging="360"/>
-      </w:pPr>
-    </w:lvl>
-    <w:lvl w:ilvl="2" w:tplc="F5D8E55E" w:tentative="1">
-      <w:start w:val="1"/>
-      <w:numFmt w:val="lowerRoman"/>
-      <w:lvlText w:val="%3."/>
-      <w:lvlJc w:val="left"/>
-      <w:pPr>
-        <w:ind w:left="1440" w:hanging="360"/>
-      </w:pPr>
-    </w:lvl>
-    <w:lvl w:ilvl="3" w:tplc="092C1E8C">
-      <w:numFmt w:val="decimal"/>
-      <w:lvlText w:val=""/>
-      <w:lvlJc w:val="left"/>
-    </w:lvl>
-    <w:lvl w:ilvl="4" w:tplc="2C60E90C">
-      <w:numFmt w:val="decimal"/>
-      <w:lvlText w:val=""/>
-      <w:lvlJc w:val="left"/>
-    </w:lvl>
-    <w:lvl w:ilvl="5" w:tplc="125CB19A">
-      <w:numFmt w:val="decimal"/>
-      <w:lvlText w:val=""/>
-      <w:lvlJc w:val="left"/>
-    </w:lvl>
-    <w:lvl w:ilvl="6" w:tplc="FA2E61F0">
-      <w:numFmt w:val="decimal"/>
-      <w:lvlText w:val=""/>
-      <w:lvlJc w:val="left"/>
-    </w:lvl>
-    <w:lvl w:ilvl="7" w:tplc="B30C5E32">
-      <w:numFmt w:val="decimal"/>
-      <w:lvlText w:val=""/>
-      <w:lvlJc w:val="left"/>
-    </w:lvl>
-    <w:lvl w:ilvl="8" w:tplc="3B1ABD80">
-      <w:numFmt w:val="decimal"/>
-      <w:lvlText w:val=""/>
-      <w:lvlJc w:val="left"/>
-    </w:lvl>
-  </w:abstractNum>
-  <w:abstractNum w:abstractNumId="2" w15:restartNumberingAfterBreak="0">
-    <w:nsid w:val="7307198B"/>
-    <w:multiLevelType w:val="hybridMultilevel"/>
-    <w:tmpl w:val="5650B8AE"/>
-    <w:lvl w:ilvl="0" w:tplc="5C1AB9BA">
-      <w:start w:val="1"/>
-      <w:numFmt w:val="bullet"/>
-      <w:lvlText w:val="•"/>
-      <w:lvlJc w:val="left"/>
-      <w:pPr>
-        <w:ind w:left="720" w:hanging="280"/>
-      </w:pPr>
-    </w:lvl>
-    <w:lvl w:ilvl="1" w:tplc="C6E27EEA" w:tentative="1">
-      <w:start w:val="1"/>
-      <w:numFmt w:val="bullet"/>
-      <w:lvlText w:val="–"/>
-      <w:lvlJc w:val="left"/>
-      <w:pPr>
-        <w:ind w:left="1080" w:hanging="280"/>
-      </w:pPr>
-    </w:lvl>
-    <w:lvl w:ilvl="2" w:tplc="69C40DF2" w:tentative="1">
-      <w:start w:val="1"/>
-      <w:numFmt w:val="bullet"/>
-      <w:lvlText w:val="▪"/>
-      <w:lvlJc w:val="left"/>
-      <w:pPr>
-        <w:ind w:left="1440" w:hanging="280"/>
-      </w:pPr>
-    </w:lvl>
-    <w:lvl w:ilvl="3" w:tplc="4094FE24">
-      <w:numFmt w:val="decimal"/>
-      <w:lvlText w:val=""/>
-      <w:lvlJc w:val="left"/>
-    </w:lvl>
-    <w:lvl w:ilvl="4" w:tplc="67C0A6E2">
-      <w:numFmt w:val="decimal"/>
-      <w:lvlText w:val=""/>
-      <w:lvlJc w:val="left"/>
-    </w:lvl>
-    <w:lvl w:ilvl="5" w:tplc="BAAE30D6">
-      <w:numFmt w:val="decimal"/>
-      <w:lvlText w:val=""/>
-      <w:lvlJc w:val="left"/>
-    </w:lvl>
-    <w:lvl w:ilvl="6" w:tplc="115EA970">
-      <w:numFmt w:val="decimal"/>
-      <w:lvlText w:val=""/>
-      <w:lvlJc w:val="left"/>
-    </w:lvl>
-    <w:lvl w:ilvl="7" w:tplc="D4D21C56">
-      <w:numFmt w:val="decimal"/>
-      <w:lvlText w:val=""/>
-      <w:lvlJc w:val="left"/>
-    </w:lvl>
-    <w:lvl w:ilvl="8" w:tplc="645C88A8">
-      <w:numFmt w:val="decimal"/>
-      <w:lvlText w:val=""/>
-      <w:lvlJc w:val="left"/>
-    </w:lvl>
-  </w:abstractNum>
-  <w:num w:numId="1" w16cid:durableId="1494562736">
-    <w:abstractNumId w:val="0"/>
+  <w:num w:numId="1" w16cid:durableId="1965573156">
+    <w:abstractNumId w:val="2"/>
     <w:lvlOverride w:ilvl="0">
       <w:startOverride w:val="1"/>
     </w:lvlOverride>
   </w:num>
-  <w:num w:numId="2" w16cid:durableId="1351419715">
-    <w:abstractNumId w:val="2"/>
+  <w:num w:numId="2" w16cid:durableId="1970043296">
+    <w:abstractNumId w:val="0"/>
     <w:lvlOverride w:ilvl="0">
       <w:startOverride w:val="1"/>
     </w:lvlOverride>
@@ -18069,7 +18155,7 @@
     <w:autoRedefine/>
     <w:uiPriority w:val="39"/>
     <w:unhideWhenUsed/>
-    <w:rsid w:val="0064322E"/>
+    <w:rsid w:val="000B2CE0"/>
     <w:pPr>
       <w:spacing w:after="100"/>
     </w:pPr>
@@ -18081,7 +18167,7 @@
     <w:autoRedefine/>
     <w:uiPriority w:val="39"/>
     <w:unhideWhenUsed/>
-    <w:rsid w:val="0064322E"/>
+    <w:rsid w:val="000B2CE0"/>
     <w:pPr>
       <w:spacing w:after="100"/>
       <w:ind w:left="210"/>
@@ -18093,7 +18179,7 @@
     <w:next w:val="Normal"/>
     <w:uiPriority w:val="99"/>
     <w:unhideWhenUsed/>
-    <w:rsid w:val="0064322E"/>
+    <w:rsid w:val="000B2CE0"/>
   </w:style>
 </w:styles>
 </file>

</xml_diff>